<commit_message>
Actualizacion documentacion hasta páso 3
</commit_message>
<xml_diff>
--- a/documentos/Documentacion Evaluacion.docx
+++ b/documentos/Documentacion Evaluacion.docx
@@ -8,20 +8,1113 @@
           <w:lang w:val="es-MX"/>
         </w:rPr>
       </w:pPr>
-      <w:proofErr w:type="spellStart"/>
-      <w:r>
-        <w:rPr>
-          <w:lang w:val="es-MX"/>
-        </w:rPr>
-        <w:t>Documentacion</w:t>
-      </w:r>
-      <w:proofErr w:type="spellEnd"/>
-      <w:r>
-        <w:rPr>
-          <w:lang w:val="es-MX"/>
-        </w:rPr>
-        <w:t xml:space="preserve"> Evaluacion</w:t>
-      </w:r>
+      <w:r>
+        <w:rPr>
+          <w:lang w:val="es-MX"/>
+        </w:rPr>
+        <w:t>Documentación</w:t>
+      </w:r>
+      <w:r>
+        <w:rPr>
+          <w:lang w:val="es-MX"/>
+        </w:rPr>
+        <w:t xml:space="preserve"> </w:t>
+      </w:r>
+      <w:r>
+        <w:rPr>
+          <w:lang w:val="es-MX"/>
+        </w:rPr>
+        <w:t>Evaluación</w:t>
+      </w:r>
+    </w:p>
+    <w:p>
+      <w:pPr>
+        <w:rPr>
+          <w:lang w:val="es-MX"/>
+        </w:rPr>
+      </w:pPr>
+      <w:r>
+        <w:rPr>
+          <w:lang w:val="es-MX"/>
+        </w:rPr>
+        <w:t xml:space="preserve">Aprendices: </w:t>
+      </w:r>
+      <w:proofErr w:type="spellStart"/>
+      <w:r>
+        <w:rPr>
+          <w:lang w:val="es-MX"/>
+        </w:rPr>
+        <w:t>Andres</w:t>
+      </w:r>
+      <w:proofErr w:type="spellEnd"/>
+      <w:r>
+        <w:rPr>
+          <w:lang w:val="es-MX"/>
+        </w:rPr>
+        <w:t xml:space="preserve"> </w:t>
+      </w:r>
+      <w:r>
+        <w:rPr>
+          <w:lang w:val="es-MX"/>
+        </w:rPr>
+        <w:tab/>
+        <w:t xml:space="preserve">Felipe Sanabria Andrade, Miguel </w:t>
+      </w:r>
+      <w:proofErr w:type="spellStart"/>
+      <w:r>
+        <w:rPr>
+          <w:lang w:val="es-MX"/>
+        </w:rPr>
+        <w:t>Angel</w:t>
+      </w:r>
+      <w:proofErr w:type="spellEnd"/>
+      <w:r>
+        <w:rPr>
+          <w:lang w:val="es-MX"/>
+        </w:rPr>
+        <w:t xml:space="preserve"> Solarte Aristizabal, Brandon Steven Piedrahita, Jean Pierre Mejia Muñoz</w:t>
+      </w:r>
+    </w:p>
+    <w:p>
+      <w:pPr>
+        <w:rPr>
+          <w:lang w:val="es-MX"/>
+        </w:rPr>
+      </w:pPr>
+      <w:r>
+        <w:rPr>
+          <w:lang w:val="es-MX"/>
+        </w:rPr>
+        <w:t>Para la realización de esta evaluación se tuvo que crear un repositorio el cual debía ser manejado por cuatros personas y que cada uno manejara su rama propia, a continuación, se muestran los pasos a seguir:</w:t>
+      </w:r>
+    </w:p>
+    <w:p>
+      <w:pPr>
+        <w:rPr>
+          <w:lang w:val="es-MX"/>
+        </w:rPr>
+      </w:pPr>
+    </w:p>
+    <w:p>
+      <w:pPr>
+        <w:rPr>
+          <w:lang w:val="es-MX"/>
+        </w:rPr>
+      </w:pPr>
+      <w:r>
+        <w:rPr>
+          <w:lang w:val="es-MX"/>
+        </w:rPr>
+        <w:t>Paso 1: Crear la carpeta para inicializar el repositorio con el comando (</w:t>
+      </w:r>
+      <w:proofErr w:type="spellStart"/>
+      <w:r>
+        <w:rPr>
+          <w:lang w:val="es-MX"/>
+        </w:rPr>
+        <w:t>git</w:t>
+      </w:r>
+      <w:proofErr w:type="spellEnd"/>
+      <w:r>
+        <w:rPr>
+          <w:lang w:val="es-MX"/>
+        </w:rPr>
+        <w:t xml:space="preserve"> </w:t>
+      </w:r>
+      <w:proofErr w:type="spellStart"/>
+      <w:r>
+        <w:rPr>
+          <w:lang w:val="es-MX"/>
+        </w:rPr>
+        <w:t>init</w:t>
+      </w:r>
+      <w:proofErr w:type="spellEnd"/>
+      <w:r>
+        <w:rPr>
+          <w:lang w:val="es-MX"/>
+        </w:rPr>
+        <w:t xml:space="preserve">) después cambiar el nombre de la rama principal de </w:t>
+      </w:r>
+      <w:proofErr w:type="gramStart"/>
+      <w:r>
+        <w:rPr>
+          <w:lang w:val="es-MX"/>
+        </w:rPr>
+        <w:t>master</w:t>
+      </w:r>
+      <w:proofErr w:type="gramEnd"/>
+      <w:r>
+        <w:rPr>
+          <w:lang w:val="es-MX"/>
+        </w:rPr>
+        <w:t xml:space="preserve"> a </w:t>
+      </w:r>
+      <w:proofErr w:type="spellStart"/>
+      <w:r>
+        <w:rPr>
+          <w:lang w:val="es-MX"/>
+        </w:rPr>
+        <w:t>main</w:t>
+      </w:r>
+      <w:proofErr w:type="spellEnd"/>
+      <w:r>
+        <w:rPr>
+          <w:lang w:val="es-MX"/>
+        </w:rPr>
+        <w:t xml:space="preserve"> consecuentemente crear un archivo README.md para la rama </w:t>
+      </w:r>
+      <w:proofErr w:type="spellStart"/>
+      <w:r>
+        <w:rPr>
+          <w:lang w:val="es-MX"/>
+        </w:rPr>
+        <w:t>main</w:t>
+      </w:r>
+      <w:proofErr w:type="spellEnd"/>
+      <w:r>
+        <w:rPr>
+          <w:lang w:val="es-MX"/>
+        </w:rPr>
+        <w:t xml:space="preserve"> con el comando (</w:t>
+      </w:r>
+      <w:proofErr w:type="gramStart"/>
+      <w:r>
+        <w:rPr>
+          <w:lang w:val="es-MX"/>
+        </w:rPr>
+        <w:t>echo ”</w:t>
+      </w:r>
+      <w:proofErr w:type="gramEnd"/>
+      <w:r>
+        <w:rPr>
+          <w:lang w:val="es-MX"/>
+        </w:rPr>
+        <w:t xml:space="preserve"># Practica </w:t>
+      </w:r>
+      <w:proofErr w:type="gramStart"/>
+      <w:r>
+        <w:rPr>
+          <w:lang w:val="es-MX"/>
+        </w:rPr>
+        <w:t>Git ”</w:t>
+      </w:r>
+      <w:proofErr w:type="gramEnd"/>
+      <w:r>
+        <w:rPr>
+          <w:lang w:val="es-MX"/>
+        </w:rPr>
+        <w:t>&gt; README.md) y agregarlo a la rama con el comando (</w:t>
+      </w:r>
+      <w:proofErr w:type="spellStart"/>
+      <w:r>
+        <w:rPr>
+          <w:lang w:val="es-MX"/>
+        </w:rPr>
+        <w:t>git</w:t>
+      </w:r>
+      <w:proofErr w:type="spellEnd"/>
+      <w:r>
+        <w:rPr>
+          <w:lang w:val="es-MX"/>
+        </w:rPr>
+        <w:t xml:space="preserve"> </w:t>
+      </w:r>
+      <w:proofErr w:type="gramStart"/>
+      <w:r>
+        <w:rPr>
+          <w:lang w:val="es-MX"/>
+        </w:rPr>
+        <w:t>add .</w:t>
+      </w:r>
+      <w:proofErr w:type="gramEnd"/>
+      <w:r>
+        <w:rPr>
+          <w:lang w:val="es-MX"/>
+        </w:rPr>
+        <w:t xml:space="preserve">) después deberemos hacer un </w:t>
+      </w:r>
+      <w:proofErr w:type="spellStart"/>
+      <w:r>
+        <w:rPr>
+          <w:lang w:val="es-MX"/>
+        </w:rPr>
+        <w:t>commit</w:t>
+      </w:r>
+      <w:proofErr w:type="spellEnd"/>
+      <w:r>
+        <w:rPr>
+          <w:lang w:val="es-MX"/>
+        </w:rPr>
+        <w:t xml:space="preserve"> de lo que hicimos (</w:t>
+      </w:r>
+      <w:proofErr w:type="spellStart"/>
+      <w:r>
+        <w:rPr>
+          <w:lang w:val="es-MX"/>
+        </w:rPr>
+        <w:t>git</w:t>
+      </w:r>
+      <w:proofErr w:type="spellEnd"/>
+      <w:r>
+        <w:rPr>
+          <w:lang w:val="es-MX"/>
+        </w:rPr>
+        <w:t xml:space="preserve"> </w:t>
+      </w:r>
+      <w:proofErr w:type="spellStart"/>
+      <w:r>
+        <w:rPr>
+          <w:lang w:val="es-MX"/>
+        </w:rPr>
+        <w:t>commit</w:t>
+      </w:r>
+      <w:proofErr w:type="spellEnd"/>
+      <w:r>
+        <w:rPr>
+          <w:lang w:val="es-MX"/>
+        </w:rPr>
+        <w:t xml:space="preserve"> -m “V1”).</w:t>
+      </w:r>
+    </w:p>
+    <w:p>
+      <w:pPr>
+        <w:rPr>
+          <w:lang w:val="es-MX"/>
+        </w:rPr>
+      </w:pPr>
+      <w:r>
+        <w:rPr>
+          <w:lang w:val="es-MX"/>
+        </w:rPr>
+        <w:drawing>
+          <wp:inline distT="0" distB="0" distL="0" distR="0" wp14:anchorId="17D63721" wp14:editId="22089792">
+            <wp:extent cx="5400040" cy="2519045"/>
+            <wp:effectExtent l="0" t="0" r="0" b="0"/>
+            <wp:docPr id="1269252073" name="Imagen 1"/>
+            <wp:cNvGraphicFramePr>
+              <a:graphicFrameLocks xmlns:a="http://schemas.openxmlformats.org/drawingml/2006/main" noChangeAspect="1"/>
+            </wp:cNvGraphicFramePr>
+            <a:graphic xmlns:a="http://schemas.openxmlformats.org/drawingml/2006/main">
+              <a:graphicData uri="http://schemas.openxmlformats.org/drawingml/2006/picture">
+                <pic:pic xmlns:pic="http://schemas.openxmlformats.org/drawingml/2006/picture">
+                  <pic:nvPicPr>
+                    <pic:cNvPr id="1269252073" name=""/>
+                    <pic:cNvPicPr/>
+                  </pic:nvPicPr>
+                  <pic:blipFill>
+                    <a:blip r:embed="rId4"/>
+                    <a:stretch>
+                      <a:fillRect/>
+                    </a:stretch>
+                  </pic:blipFill>
+                  <pic:spPr>
+                    <a:xfrm>
+                      <a:off x="0" y="0"/>
+                      <a:ext cx="5400040" cy="2519045"/>
+                    </a:xfrm>
+                    <a:prstGeom prst="rect">
+                      <a:avLst/>
+                    </a:prstGeom>
+                  </pic:spPr>
+                </pic:pic>
+              </a:graphicData>
+            </a:graphic>
+          </wp:inline>
+        </w:drawing>
+      </w:r>
+    </w:p>
+    <w:p>
+      <w:pPr>
+        <w:rPr>
+          <w:lang w:val="es-MX"/>
+        </w:rPr>
+      </w:pPr>
+      <w:r>
+        <w:rPr>
+          <w:lang w:val="es-MX"/>
+        </w:rPr>
+        <w:drawing>
+          <wp:inline distT="0" distB="0" distL="0" distR="0" wp14:anchorId="2CFF66F1" wp14:editId="03BC18FD">
+            <wp:extent cx="5400040" cy="2909570"/>
+            <wp:effectExtent l="0" t="0" r="0" b="5080"/>
+            <wp:docPr id="2034307491" name="Imagen 1"/>
+            <wp:cNvGraphicFramePr>
+              <a:graphicFrameLocks xmlns:a="http://schemas.openxmlformats.org/drawingml/2006/main" noChangeAspect="1"/>
+            </wp:cNvGraphicFramePr>
+            <a:graphic xmlns:a="http://schemas.openxmlformats.org/drawingml/2006/main">
+              <a:graphicData uri="http://schemas.openxmlformats.org/drawingml/2006/picture">
+                <pic:pic xmlns:pic="http://schemas.openxmlformats.org/drawingml/2006/picture">
+                  <pic:nvPicPr>
+                    <pic:cNvPr id="2034307491" name=""/>
+                    <pic:cNvPicPr/>
+                  </pic:nvPicPr>
+                  <pic:blipFill>
+                    <a:blip r:embed="rId5"/>
+                    <a:stretch>
+                      <a:fillRect/>
+                    </a:stretch>
+                  </pic:blipFill>
+                  <pic:spPr>
+                    <a:xfrm>
+                      <a:off x="0" y="0"/>
+                      <a:ext cx="5400040" cy="2909570"/>
+                    </a:xfrm>
+                    <a:prstGeom prst="rect">
+                      <a:avLst/>
+                    </a:prstGeom>
+                  </pic:spPr>
+                </pic:pic>
+              </a:graphicData>
+            </a:graphic>
+          </wp:inline>
+        </w:drawing>
+      </w:r>
+    </w:p>
+    <w:p>
+      <w:pPr>
+        <w:rPr>
+          <w:lang w:val="es-MX"/>
+        </w:rPr>
+      </w:pPr>
+      <w:r>
+        <w:rPr>
+          <w:lang w:val="es-MX"/>
+        </w:rPr>
+        <w:lastRenderedPageBreak/>
+        <w:drawing>
+          <wp:inline distT="0" distB="0" distL="0" distR="0" wp14:anchorId="58D0848B" wp14:editId="52799F6A">
+            <wp:extent cx="5077534" cy="3105583"/>
+            <wp:effectExtent l="0" t="0" r="8890" b="0"/>
+            <wp:docPr id="436573344" name="Imagen 1"/>
+            <wp:cNvGraphicFramePr>
+              <a:graphicFrameLocks xmlns:a="http://schemas.openxmlformats.org/drawingml/2006/main" noChangeAspect="1"/>
+            </wp:cNvGraphicFramePr>
+            <a:graphic xmlns:a="http://schemas.openxmlformats.org/drawingml/2006/main">
+              <a:graphicData uri="http://schemas.openxmlformats.org/drawingml/2006/picture">
+                <pic:pic xmlns:pic="http://schemas.openxmlformats.org/drawingml/2006/picture">
+                  <pic:nvPicPr>
+                    <pic:cNvPr id="436573344" name=""/>
+                    <pic:cNvPicPr/>
+                  </pic:nvPicPr>
+                  <pic:blipFill>
+                    <a:blip r:embed="rId6"/>
+                    <a:stretch>
+                      <a:fillRect/>
+                    </a:stretch>
+                  </pic:blipFill>
+                  <pic:spPr>
+                    <a:xfrm>
+                      <a:off x="0" y="0"/>
+                      <a:ext cx="5077534" cy="3105583"/>
+                    </a:xfrm>
+                    <a:prstGeom prst="rect">
+                      <a:avLst/>
+                    </a:prstGeom>
+                  </pic:spPr>
+                </pic:pic>
+              </a:graphicData>
+            </a:graphic>
+          </wp:inline>
+        </w:drawing>
+      </w:r>
+    </w:p>
+    <w:p>
+      <w:pPr>
+        <w:rPr>
+          <w:lang w:val="es-MX"/>
+        </w:rPr>
+      </w:pPr>
+      <w:r>
+        <w:rPr>
+          <w:lang w:val="es-MX"/>
+        </w:rPr>
+        <w:drawing>
+          <wp:inline distT="0" distB="0" distL="0" distR="0" wp14:anchorId="56012868" wp14:editId="0577FDFE">
+            <wp:extent cx="4944165" cy="552527"/>
+            <wp:effectExtent l="0" t="0" r="8890" b="0"/>
+            <wp:docPr id="490315733" name="Imagen 1"/>
+            <wp:cNvGraphicFramePr>
+              <a:graphicFrameLocks xmlns:a="http://schemas.openxmlformats.org/drawingml/2006/main" noChangeAspect="1"/>
+            </wp:cNvGraphicFramePr>
+            <a:graphic xmlns:a="http://schemas.openxmlformats.org/drawingml/2006/main">
+              <a:graphicData uri="http://schemas.openxmlformats.org/drawingml/2006/picture">
+                <pic:pic xmlns:pic="http://schemas.openxmlformats.org/drawingml/2006/picture">
+                  <pic:nvPicPr>
+                    <pic:cNvPr id="490315733" name=""/>
+                    <pic:cNvPicPr/>
+                  </pic:nvPicPr>
+                  <pic:blipFill>
+                    <a:blip r:embed="rId7"/>
+                    <a:stretch>
+                      <a:fillRect/>
+                    </a:stretch>
+                  </pic:blipFill>
+                  <pic:spPr>
+                    <a:xfrm>
+                      <a:off x="0" y="0"/>
+                      <a:ext cx="4944165" cy="552527"/>
+                    </a:xfrm>
+                    <a:prstGeom prst="rect">
+                      <a:avLst/>
+                    </a:prstGeom>
+                  </pic:spPr>
+                </pic:pic>
+              </a:graphicData>
+            </a:graphic>
+          </wp:inline>
+        </w:drawing>
+      </w:r>
+    </w:p>
+    <w:p>
+      <w:pPr>
+        <w:rPr>
+          <w:lang w:val="es-MX"/>
+        </w:rPr>
+      </w:pPr>
+    </w:p>
+    <w:p>
+      <w:pPr>
+        <w:rPr>
+          <w:lang w:val="es-MX"/>
+        </w:rPr>
+      </w:pPr>
+      <w:r>
+        <w:rPr>
+          <w:lang w:val="es-MX"/>
+        </w:rPr>
+        <w:t>Paso 2: Ahora crearemos las nuevas cuatro ramas que necesitaremos con el comando (</w:t>
+      </w:r>
+      <w:proofErr w:type="spellStart"/>
+      <w:r>
+        <w:rPr>
+          <w:lang w:val="es-MX"/>
+        </w:rPr>
+        <w:t>git</w:t>
+      </w:r>
+      <w:proofErr w:type="spellEnd"/>
+      <w:r>
+        <w:rPr>
+          <w:lang w:val="es-MX"/>
+        </w:rPr>
+        <w:t xml:space="preserve"> </w:t>
+      </w:r>
+      <w:proofErr w:type="spellStart"/>
+      <w:r>
+        <w:rPr>
+          <w:lang w:val="es-MX"/>
+        </w:rPr>
+        <w:t>branch</w:t>
+      </w:r>
+      <w:proofErr w:type="spellEnd"/>
+      <w:r>
+        <w:rPr>
+          <w:lang w:val="es-MX"/>
+        </w:rPr>
+        <w:t xml:space="preserve"> estudiante1) así consecuentemente con cada una de las ramas y para verificar que las ramas ya se han creado usamos el comando (</w:t>
+      </w:r>
+      <w:proofErr w:type="spellStart"/>
+      <w:r>
+        <w:rPr>
+          <w:lang w:val="es-MX"/>
+        </w:rPr>
+        <w:t>git</w:t>
+      </w:r>
+      <w:proofErr w:type="spellEnd"/>
+      <w:r>
+        <w:rPr>
+          <w:lang w:val="es-MX"/>
+        </w:rPr>
+        <w:t xml:space="preserve"> </w:t>
+      </w:r>
+      <w:proofErr w:type="spellStart"/>
+      <w:r>
+        <w:rPr>
+          <w:lang w:val="es-MX"/>
+        </w:rPr>
+        <w:t>branch</w:t>
+      </w:r>
+      <w:proofErr w:type="spellEnd"/>
+      <w:r>
+        <w:rPr>
+          <w:lang w:val="es-MX"/>
+        </w:rPr>
+        <w:t>).</w:t>
+      </w:r>
+    </w:p>
+    <w:p>
+      <w:pPr>
+        <w:rPr>
+          <w:lang w:val="es-MX"/>
+        </w:rPr>
+      </w:pPr>
+      <w:r>
+        <w:rPr>
+          <w:lang w:val="es-MX"/>
+        </w:rPr>
+        <w:drawing>
+          <wp:inline distT="0" distB="0" distL="0" distR="0" wp14:anchorId="0BB59CDB" wp14:editId="514F3DEC">
+            <wp:extent cx="4858428" cy="2772162"/>
+            <wp:effectExtent l="0" t="0" r="0" b="9525"/>
+            <wp:docPr id="2059509590" name="Imagen 1"/>
+            <wp:cNvGraphicFramePr>
+              <a:graphicFrameLocks xmlns:a="http://schemas.openxmlformats.org/drawingml/2006/main" noChangeAspect="1"/>
+            </wp:cNvGraphicFramePr>
+            <a:graphic xmlns:a="http://schemas.openxmlformats.org/drawingml/2006/main">
+              <a:graphicData uri="http://schemas.openxmlformats.org/drawingml/2006/picture">
+                <pic:pic xmlns:pic="http://schemas.openxmlformats.org/drawingml/2006/picture">
+                  <pic:nvPicPr>
+                    <pic:cNvPr id="2059509590" name=""/>
+                    <pic:cNvPicPr/>
+                  </pic:nvPicPr>
+                  <pic:blipFill>
+                    <a:blip r:embed="rId8"/>
+                    <a:stretch>
+                      <a:fillRect/>
+                    </a:stretch>
+                  </pic:blipFill>
+                  <pic:spPr>
+                    <a:xfrm>
+                      <a:off x="0" y="0"/>
+                      <a:ext cx="4858428" cy="2772162"/>
+                    </a:xfrm>
+                    <a:prstGeom prst="rect">
+                      <a:avLst/>
+                    </a:prstGeom>
+                  </pic:spPr>
+                </pic:pic>
+              </a:graphicData>
+            </a:graphic>
+          </wp:inline>
+        </w:drawing>
+      </w:r>
+    </w:p>
+    <w:p>
+      <w:pPr>
+        <w:rPr>
+          <w:lang w:val="es-MX"/>
+        </w:rPr>
+      </w:pPr>
+    </w:p>
+    <w:p>
+      <w:pPr>
+        <w:rPr>
+          <w:lang w:val="es-MX"/>
+        </w:rPr>
+      </w:pPr>
+    </w:p>
+    <w:p>
+      <w:pPr>
+        <w:rPr>
+          <w:lang w:val="es-MX"/>
+        </w:rPr>
+      </w:pPr>
+      <w:r>
+        <w:rPr>
+          <w:lang w:val="es-MX"/>
+        </w:rPr>
+        <w:lastRenderedPageBreak/>
+        <w:t>Paso 3: Ahora deberemos conectar a nuestro repositorio con el mismo nombre que hicimos en local para que se puedan conectar con el comando (</w:t>
+      </w:r>
+      <w:proofErr w:type="spellStart"/>
+      <w:r>
+        <w:rPr>
+          <w:lang w:val="es-MX"/>
+        </w:rPr>
+        <w:t>git</w:t>
+      </w:r>
+      <w:proofErr w:type="spellEnd"/>
+      <w:r>
+        <w:rPr>
+          <w:lang w:val="es-MX"/>
+        </w:rPr>
+        <w:t xml:space="preserve"> remote </w:t>
+      </w:r>
+      <w:proofErr w:type="spellStart"/>
+      <w:r>
+        <w:rPr>
+          <w:lang w:val="es-MX"/>
+        </w:rPr>
+        <w:t>add</w:t>
+      </w:r>
+      <w:proofErr w:type="spellEnd"/>
+      <w:r>
+        <w:rPr>
+          <w:lang w:val="es-MX"/>
+        </w:rPr>
+        <w:t xml:space="preserve"> </w:t>
+      </w:r>
+      <w:proofErr w:type="spellStart"/>
+      <w:r>
+        <w:rPr>
+          <w:lang w:val="es-MX"/>
+        </w:rPr>
+        <w:t>origin</w:t>
+      </w:r>
+      <w:proofErr w:type="spellEnd"/>
+      <w:r>
+        <w:rPr>
+          <w:lang w:val="es-MX"/>
+        </w:rPr>
+        <w:t xml:space="preserve"> https://github.com/NOMBRE_DUEÑO_REPOSITORIO/evaluacion.git) y después enviar la rama </w:t>
+      </w:r>
+      <w:proofErr w:type="spellStart"/>
+      <w:r>
+        <w:rPr>
+          <w:lang w:val="es-MX"/>
+        </w:rPr>
+        <w:t>main</w:t>
+      </w:r>
+      <w:proofErr w:type="spellEnd"/>
+      <w:r>
+        <w:rPr>
+          <w:lang w:val="es-MX"/>
+        </w:rPr>
+        <w:t xml:space="preserve"> con el archivo README.md al repo con el comando (</w:t>
+      </w:r>
+      <w:proofErr w:type="spellStart"/>
+      <w:r>
+        <w:rPr>
+          <w:lang w:val="es-MX"/>
+        </w:rPr>
+        <w:t>git</w:t>
+      </w:r>
+      <w:proofErr w:type="spellEnd"/>
+      <w:r>
+        <w:rPr>
+          <w:lang w:val="es-MX"/>
+        </w:rPr>
+        <w:t xml:space="preserve"> </w:t>
+      </w:r>
+      <w:proofErr w:type="spellStart"/>
+      <w:r>
+        <w:rPr>
+          <w:lang w:val="es-MX"/>
+        </w:rPr>
+        <w:t>push</w:t>
+      </w:r>
+      <w:proofErr w:type="spellEnd"/>
+      <w:r>
+        <w:rPr>
+          <w:lang w:val="es-MX"/>
+        </w:rPr>
+        <w:t xml:space="preserve"> -u </w:t>
+      </w:r>
+      <w:proofErr w:type="spellStart"/>
+      <w:r>
+        <w:rPr>
+          <w:lang w:val="es-MX"/>
+        </w:rPr>
+        <w:t>origin</w:t>
+      </w:r>
+      <w:proofErr w:type="spellEnd"/>
+      <w:r>
+        <w:rPr>
+          <w:lang w:val="es-MX"/>
+        </w:rPr>
+        <w:t xml:space="preserve"> </w:t>
+      </w:r>
+      <w:proofErr w:type="spellStart"/>
+      <w:r>
+        <w:rPr>
+          <w:lang w:val="es-MX"/>
+        </w:rPr>
+        <w:t>main</w:t>
+      </w:r>
+      <w:proofErr w:type="spellEnd"/>
+      <w:r>
+        <w:rPr>
+          <w:lang w:val="es-MX"/>
+        </w:rPr>
+        <w:t xml:space="preserve">) Si queremos también mandar las otras cuatro ramas para que queden en el repositorio creadas aunque sin nada deberemos usar el mismo comando </w:t>
+      </w:r>
+      <w:proofErr w:type="spellStart"/>
+      <w:r>
+        <w:rPr>
+          <w:lang w:val="es-MX"/>
+        </w:rPr>
+        <w:t>push</w:t>
+      </w:r>
+      <w:proofErr w:type="spellEnd"/>
+      <w:r>
+        <w:rPr>
+          <w:lang w:val="es-MX"/>
+        </w:rPr>
+        <w:t xml:space="preserve"> que hicimos para el </w:t>
+      </w:r>
+      <w:proofErr w:type="spellStart"/>
+      <w:r>
+        <w:rPr>
+          <w:lang w:val="es-MX"/>
+        </w:rPr>
+        <w:t>main</w:t>
+      </w:r>
+      <w:proofErr w:type="spellEnd"/>
+      <w:r>
+        <w:rPr>
+          <w:lang w:val="es-MX"/>
+        </w:rPr>
+        <w:t xml:space="preserve"> pero sin </w:t>
+      </w:r>
+      <w:proofErr w:type="spellStart"/>
+      <w:r>
+        <w:rPr>
+          <w:lang w:val="es-MX"/>
+        </w:rPr>
+        <w:t>el</w:t>
+      </w:r>
+      <w:proofErr w:type="spellEnd"/>
+      <w:r>
+        <w:rPr>
+          <w:lang w:val="es-MX"/>
+        </w:rPr>
+        <w:t xml:space="preserve"> (-u) entonces quedaría así (</w:t>
+      </w:r>
+      <w:proofErr w:type="spellStart"/>
+      <w:r>
+        <w:rPr>
+          <w:lang w:val="es-MX"/>
+        </w:rPr>
+        <w:t>git</w:t>
+      </w:r>
+      <w:proofErr w:type="spellEnd"/>
+      <w:r>
+        <w:rPr>
+          <w:lang w:val="es-MX"/>
+        </w:rPr>
+        <w:t xml:space="preserve"> </w:t>
+      </w:r>
+      <w:proofErr w:type="spellStart"/>
+      <w:r>
+        <w:rPr>
+          <w:lang w:val="es-MX"/>
+        </w:rPr>
+        <w:t>push</w:t>
+      </w:r>
+      <w:proofErr w:type="spellEnd"/>
+      <w:r>
+        <w:rPr>
+          <w:lang w:val="es-MX"/>
+        </w:rPr>
+        <w:t xml:space="preserve"> estudiante 1) y para cambiar de rama solo haremos el siguiente comando (</w:t>
+      </w:r>
+      <w:proofErr w:type="spellStart"/>
+      <w:r>
+        <w:rPr>
+          <w:lang w:val="es-MX"/>
+        </w:rPr>
+        <w:t>git</w:t>
+      </w:r>
+      <w:proofErr w:type="spellEnd"/>
+      <w:r>
+        <w:rPr>
+          <w:lang w:val="es-MX"/>
+        </w:rPr>
+        <w:t xml:space="preserve"> </w:t>
+      </w:r>
+      <w:proofErr w:type="spellStart"/>
+      <w:r>
+        <w:rPr>
+          <w:lang w:val="es-MX"/>
+        </w:rPr>
+        <w:t>checkout</w:t>
+      </w:r>
+      <w:proofErr w:type="spellEnd"/>
+      <w:r>
+        <w:rPr>
+          <w:lang w:val="es-MX"/>
+        </w:rPr>
+        <w:t xml:space="preserve"> estudiante1).</w:t>
+      </w:r>
+    </w:p>
+    <w:p>
+      <w:pPr>
+        <w:rPr>
+          <w:lang w:val="es-MX"/>
+        </w:rPr>
+      </w:pPr>
+      <w:r>
+        <w:rPr>
+          <w:lang w:val="es-MX"/>
+        </w:rPr>
+        <w:drawing>
+          <wp:inline distT="0" distB="0" distL="0" distR="0" wp14:anchorId="07FBDBB6" wp14:editId="310E58C3">
+            <wp:extent cx="5400040" cy="2788920"/>
+            <wp:effectExtent l="0" t="0" r="0" b="0"/>
+            <wp:docPr id="1773111409" name="Imagen 1"/>
+            <wp:cNvGraphicFramePr>
+              <a:graphicFrameLocks xmlns:a="http://schemas.openxmlformats.org/drawingml/2006/main" noChangeAspect="1"/>
+            </wp:cNvGraphicFramePr>
+            <a:graphic xmlns:a="http://schemas.openxmlformats.org/drawingml/2006/main">
+              <a:graphicData uri="http://schemas.openxmlformats.org/drawingml/2006/picture">
+                <pic:pic xmlns:pic="http://schemas.openxmlformats.org/drawingml/2006/picture">
+                  <pic:nvPicPr>
+                    <pic:cNvPr id="1773111409" name=""/>
+                    <pic:cNvPicPr/>
+                  </pic:nvPicPr>
+                  <pic:blipFill>
+                    <a:blip r:embed="rId9"/>
+                    <a:stretch>
+                      <a:fillRect/>
+                    </a:stretch>
+                  </pic:blipFill>
+                  <pic:spPr>
+                    <a:xfrm>
+                      <a:off x="0" y="0"/>
+                      <a:ext cx="5400040" cy="2788920"/>
+                    </a:xfrm>
+                    <a:prstGeom prst="rect">
+                      <a:avLst/>
+                    </a:prstGeom>
+                  </pic:spPr>
+                </pic:pic>
+              </a:graphicData>
+            </a:graphic>
+          </wp:inline>
+        </w:drawing>
+      </w:r>
+    </w:p>
+    <w:p>
+      <w:pPr>
+        <w:rPr>
+          <w:lang w:val="es-MX"/>
+        </w:rPr>
+      </w:pPr>
+      <w:r>
+        <w:rPr>
+          <w:lang w:val="es-MX"/>
+        </w:rPr>
+        <w:drawing>
+          <wp:inline distT="0" distB="0" distL="0" distR="0" wp14:anchorId="39C736F6" wp14:editId="2A9454C2">
+            <wp:extent cx="5039428" cy="1724266"/>
+            <wp:effectExtent l="0" t="0" r="0" b="9525"/>
+            <wp:docPr id="1665089496" name="Imagen 1"/>
+            <wp:cNvGraphicFramePr>
+              <a:graphicFrameLocks xmlns:a="http://schemas.openxmlformats.org/drawingml/2006/main" noChangeAspect="1"/>
+            </wp:cNvGraphicFramePr>
+            <a:graphic xmlns:a="http://schemas.openxmlformats.org/drawingml/2006/main">
+              <a:graphicData uri="http://schemas.openxmlformats.org/drawingml/2006/picture">
+                <pic:pic xmlns:pic="http://schemas.openxmlformats.org/drawingml/2006/picture">
+                  <pic:nvPicPr>
+                    <pic:cNvPr id="1665089496" name=""/>
+                    <pic:cNvPicPr/>
+                  </pic:nvPicPr>
+                  <pic:blipFill>
+                    <a:blip r:embed="rId10"/>
+                    <a:stretch>
+                      <a:fillRect/>
+                    </a:stretch>
+                  </pic:blipFill>
+                  <pic:spPr>
+                    <a:xfrm>
+                      <a:off x="0" y="0"/>
+                      <a:ext cx="5039428" cy="1724266"/>
+                    </a:xfrm>
+                    <a:prstGeom prst="rect">
+                      <a:avLst/>
+                    </a:prstGeom>
+                  </pic:spPr>
+                </pic:pic>
+              </a:graphicData>
+            </a:graphic>
+          </wp:inline>
+        </w:drawing>
+      </w:r>
+    </w:p>
+    <w:p>
+      <w:pPr>
+        <w:rPr>
+          <w:lang w:val="es-MX"/>
+        </w:rPr>
+      </w:pPr>
+      <w:r>
+        <w:rPr>
+          <w:lang w:val="es-MX"/>
+        </w:rPr>
+        <w:drawing>
+          <wp:inline distT="0" distB="0" distL="0" distR="0" wp14:anchorId="055F22F5" wp14:editId="2DCCC754">
+            <wp:extent cx="5201376" cy="1876687"/>
+            <wp:effectExtent l="0" t="0" r="0" b="9525"/>
+            <wp:docPr id="984238562" name="Imagen 1"/>
+            <wp:cNvGraphicFramePr>
+              <a:graphicFrameLocks xmlns:a="http://schemas.openxmlformats.org/drawingml/2006/main" noChangeAspect="1"/>
+            </wp:cNvGraphicFramePr>
+            <a:graphic xmlns:a="http://schemas.openxmlformats.org/drawingml/2006/main">
+              <a:graphicData uri="http://schemas.openxmlformats.org/drawingml/2006/picture">
+                <pic:pic xmlns:pic="http://schemas.openxmlformats.org/drawingml/2006/picture">
+                  <pic:nvPicPr>
+                    <pic:cNvPr id="984238562" name=""/>
+                    <pic:cNvPicPr/>
+                  </pic:nvPicPr>
+                  <pic:blipFill>
+                    <a:blip r:embed="rId11"/>
+                    <a:stretch>
+                      <a:fillRect/>
+                    </a:stretch>
+                  </pic:blipFill>
+                  <pic:spPr>
+                    <a:xfrm>
+                      <a:off x="0" y="0"/>
+                      <a:ext cx="5201376" cy="1876687"/>
+                    </a:xfrm>
+                    <a:prstGeom prst="rect">
+                      <a:avLst/>
+                    </a:prstGeom>
+                  </pic:spPr>
+                </pic:pic>
+              </a:graphicData>
+            </a:graphic>
+          </wp:inline>
+        </w:drawing>
+      </w:r>
+    </w:p>
+    <w:p>
+      <w:pPr>
+        <w:rPr>
+          <w:lang w:val="es-MX"/>
+        </w:rPr>
+      </w:pPr>
+      <w:r>
+        <w:rPr>
+          <w:lang w:val="es-MX"/>
+        </w:rPr>
+        <w:lastRenderedPageBreak/>
+        <w:drawing>
+          <wp:inline distT="0" distB="0" distL="0" distR="0" wp14:anchorId="6BC7D884" wp14:editId="6CCA3C2F">
+            <wp:extent cx="5239481" cy="1829055"/>
+            <wp:effectExtent l="0" t="0" r="0" b="0"/>
+            <wp:docPr id="1323710519" name="Imagen 1"/>
+            <wp:cNvGraphicFramePr>
+              <a:graphicFrameLocks xmlns:a="http://schemas.openxmlformats.org/drawingml/2006/main" noChangeAspect="1"/>
+            </wp:cNvGraphicFramePr>
+            <a:graphic xmlns:a="http://schemas.openxmlformats.org/drawingml/2006/main">
+              <a:graphicData uri="http://schemas.openxmlformats.org/drawingml/2006/picture">
+                <pic:pic xmlns:pic="http://schemas.openxmlformats.org/drawingml/2006/picture">
+                  <pic:nvPicPr>
+                    <pic:cNvPr id="1323710519" name=""/>
+                    <pic:cNvPicPr/>
+                  </pic:nvPicPr>
+                  <pic:blipFill>
+                    <a:blip r:embed="rId12"/>
+                    <a:stretch>
+                      <a:fillRect/>
+                    </a:stretch>
+                  </pic:blipFill>
+                  <pic:spPr>
+                    <a:xfrm>
+                      <a:off x="0" y="0"/>
+                      <a:ext cx="5239481" cy="1829055"/>
+                    </a:xfrm>
+                    <a:prstGeom prst="rect">
+                      <a:avLst/>
+                    </a:prstGeom>
+                  </pic:spPr>
+                </pic:pic>
+              </a:graphicData>
+            </a:graphic>
+          </wp:inline>
+        </w:drawing>
+      </w:r>
+    </w:p>
+    <w:p>
+      <w:pPr>
+        <w:rPr>
+          <w:lang w:val="es-MX"/>
+        </w:rPr>
+      </w:pPr>
+      <w:r>
+        <w:rPr>
+          <w:lang w:val="es-MX"/>
+        </w:rPr>
+        <w:drawing>
+          <wp:inline distT="0" distB="0" distL="0" distR="0" wp14:anchorId="65972160" wp14:editId="71E8451A">
+            <wp:extent cx="5268060" cy="1895740"/>
+            <wp:effectExtent l="0" t="0" r="0" b="9525"/>
+            <wp:docPr id="1834958390" name="Imagen 1"/>
+            <wp:cNvGraphicFramePr>
+              <a:graphicFrameLocks xmlns:a="http://schemas.openxmlformats.org/drawingml/2006/main" noChangeAspect="1"/>
+            </wp:cNvGraphicFramePr>
+            <a:graphic xmlns:a="http://schemas.openxmlformats.org/drawingml/2006/main">
+              <a:graphicData uri="http://schemas.openxmlformats.org/drawingml/2006/picture">
+                <pic:pic xmlns:pic="http://schemas.openxmlformats.org/drawingml/2006/picture">
+                  <pic:nvPicPr>
+                    <pic:cNvPr id="1834958390" name=""/>
+                    <pic:cNvPicPr/>
+                  </pic:nvPicPr>
+                  <pic:blipFill>
+                    <a:blip r:embed="rId13"/>
+                    <a:stretch>
+                      <a:fillRect/>
+                    </a:stretch>
+                  </pic:blipFill>
+                  <pic:spPr>
+                    <a:xfrm>
+                      <a:off x="0" y="0"/>
+                      <a:ext cx="5268060" cy="1895740"/>
+                    </a:xfrm>
+                    <a:prstGeom prst="rect">
+                      <a:avLst/>
+                    </a:prstGeom>
+                  </pic:spPr>
+                </pic:pic>
+              </a:graphicData>
+            </a:graphic>
+          </wp:inline>
+        </w:drawing>
+      </w:r>
+    </w:p>
+    <w:p>
+      <w:pPr>
+        <w:rPr>
+          <w:lang w:val="es-MX"/>
+        </w:rPr>
+      </w:pPr>
+      <w:r>
+        <w:rPr>
+          <w:lang w:val="es-MX"/>
+        </w:rPr>
+        <w:drawing>
+          <wp:inline distT="0" distB="0" distL="0" distR="0" wp14:anchorId="40EB26B8" wp14:editId="18392DF3">
+            <wp:extent cx="5134692" cy="1933845"/>
+            <wp:effectExtent l="0" t="0" r="8890" b="9525"/>
+            <wp:docPr id="449944970" name="Imagen 1"/>
+            <wp:cNvGraphicFramePr>
+              <a:graphicFrameLocks xmlns:a="http://schemas.openxmlformats.org/drawingml/2006/main" noChangeAspect="1"/>
+            </wp:cNvGraphicFramePr>
+            <a:graphic xmlns:a="http://schemas.openxmlformats.org/drawingml/2006/main">
+              <a:graphicData uri="http://schemas.openxmlformats.org/drawingml/2006/picture">
+                <pic:pic xmlns:pic="http://schemas.openxmlformats.org/drawingml/2006/picture">
+                  <pic:nvPicPr>
+                    <pic:cNvPr id="449944970" name=""/>
+                    <pic:cNvPicPr/>
+                  </pic:nvPicPr>
+                  <pic:blipFill>
+                    <a:blip r:embed="rId14"/>
+                    <a:stretch>
+                      <a:fillRect/>
+                    </a:stretch>
+                  </pic:blipFill>
+                  <pic:spPr>
+                    <a:xfrm>
+                      <a:off x="0" y="0"/>
+                      <a:ext cx="5134692" cy="1933845"/>
+                    </a:xfrm>
+                    <a:prstGeom prst="rect">
+                      <a:avLst/>
+                    </a:prstGeom>
+                  </pic:spPr>
+                </pic:pic>
+              </a:graphicData>
+            </a:graphic>
+          </wp:inline>
+        </w:drawing>
+      </w:r>
+    </w:p>
+    <w:p>
+      <w:pPr>
+        <w:rPr>
+          <w:lang w:val="es-MX"/>
+        </w:rPr>
+      </w:pPr>
     </w:p>
     <w:sectPr>
       <w:pgSz w:w="11906" w:h="16838"/>
@@ -950,6 +2043,29 @@
       <w:spacing w:val="5"/>
     </w:rPr>
   </w:style>
+  <w:style w:type="character" w:styleId="Hipervnculo">
+    <w:name w:val="Hyperlink"/>
+    <w:basedOn w:val="Fuentedeprrafopredeter"/>
+    <w:uiPriority w:val="99"/>
+    <w:unhideWhenUsed/>
+    <w:rsid w:val="006352E3"/>
+    <w:rPr>
+      <w:color w:val="467886" w:themeColor="hyperlink"/>
+      <w:u w:val="single"/>
+    </w:rPr>
+  </w:style>
+  <w:style w:type="character" w:styleId="Mencinsinresolver">
+    <w:name w:val="Unresolved Mention"/>
+    <w:basedOn w:val="Fuentedeprrafopredeter"/>
+    <w:uiPriority w:val="99"/>
+    <w:semiHidden/>
+    <w:unhideWhenUsed/>
+    <w:rsid w:val="006352E3"/>
+    <w:rPr>
+      <w:color w:val="605E5C"/>
+      <w:shd w:val="clear" w:color="auto" w:fill="E1DFDD"/>
+    </w:rPr>
+  </w:style>
 </w:styles>
 </file>
 

</xml_diff>